<commit_message>
Fix "missing fonts" in Word export: retarget reference.docx to macOS-stock fonts
Pandoc's default reference doc ships Aptos (MS 2024 default) as the theme
font and lists Aptos/Calibri/Cambria in the font table. None are installed
on macOS, so Pages reported missing fonts — the font table is the manifest
Pages reads, so unused declarations still triggered the prompt.

The reference-doc builder now retargets fonts in all four places: named
styles, docDefaults, theme major/minor Latin, and the font-table manifest
(dropping the non-macOS MS fonts). Converted output now declares only Times
New Roman + Courier New, both stock on macOS and Windows. Added the builder
script + README so the binary asset is reproducible, not a mystery blob.

Co-Authored-By: Claude Opus 4.8 <noreply@anthropic.com>
</commit_message>
<xml_diff>
--- a/src/assets/pandoc/reference-manuscript.docx
+++ b/src/assets/pandoc/reference-manuscript.docx
@@ -485,7 +485,7 @@
   <w:docDefaults>
     <w:rPrDefault>
       <w:rPr>
-        <w:rFonts w:asciiTheme="minorHAnsi" w:eastAsiaTheme="minorEastAsia" w:hAnsiTheme="minorHAnsi" w:cstheme="minorBidi"/>
+        <w:rFonts w:ascii="Times New Roman" w:hAnsi="Times New Roman" w:cs="Times New Roman" w:eastAsia="Times New Roman"/>
         <w:sz w:val="24"/>
         <w:szCs w:val="24"/>
         <w:lang w:val="en-US" w:eastAsia="zh-CN" w:bidi="ar-SA"/>
@@ -552,7 +552,7 @@
       <w:jc w:val="center"/>
     </w:pPr>
     <w:rPr>
-      <w:rFonts w:asciiTheme="majorHAnsi" w:eastAsiaTheme="majorEastAsia" w:hAnsiTheme="majorHAnsi" w:cstheme="majorBidi" w:ascii="Times New Roman" w:hAnsi="Times New Roman" w:cs="Times New Roman" w:eastAsia="Times New Roman"/>
+      <w:rFonts w:ascii="Times New Roman" w:hAnsi="Times New Roman" w:cs="Times New Roman" w:eastAsia="Times New Roman"/>
       <w:sz w:val="24"/>
       <w:szCs w:val="24"/>
     </w:rPr>
@@ -584,7 +584,7 @@
       <w:jc w:val="center"/>
     </w:pPr>
     <w:rPr>
-      <w:rFonts w:eastAsiaTheme="majorEastAsia" w:cstheme="majorBidi" w:ascii="Times New Roman" w:hAnsi="Times New Roman" w:cs="Times New Roman" w:eastAsia="Times New Roman"/>
+      <w:rFonts w:ascii="Times New Roman" w:hAnsi="Times New Roman" w:cs="Times New Roman" w:eastAsia="Times New Roman"/>
       <w:spacing w:val="15"/>
       <w:sz w:val="24"/>
       <w:szCs w:val="24"/>
@@ -693,7 +693,7 @@
       <w:pageBreakBefore/>
     </w:pPr>
     <w:rPr>
-      <w:rFonts w:asciiTheme="majorHAnsi" w:eastAsiaTheme="majorEastAsia" w:hAnsiTheme="majorHAnsi" w:cstheme="majorBidi" w:ascii="Times New Roman" w:hAnsi="Times New Roman" w:cs="Times New Roman" w:eastAsia="Times New Roman"/>
+      <w:rFonts w:ascii="Times New Roman" w:hAnsi="Times New Roman" w:cs="Times New Roman" w:eastAsia="Times New Roman"/>
       <w:sz w:val="24"/>
       <w:szCs w:val="24"/>
     </w:rPr>
@@ -716,7 +716,7 @@
       <w:jc w:val="center"/>
     </w:pPr>
     <w:rPr>
-      <w:rFonts w:asciiTheme="majorHAnsi" w:eastAsiaTheme="majorEastAsia" w:hAnsiTheme="majorHAnsi" w:cstheme="majorBidi" w:ascii="Times New Roman" w:hAnsi="Times New Roman" w:cs="Times New Roman" w:eastAsia="Times New Roman"/>
+      <w:rFonts w:ascii="Times New Roman" w:hAnsi="Times New Roman" w:cs="Times New Roman" w:eastAsia="Times New Roman"/>
       <w:sz w:val="24"/>
       <w:szCs w:val="24"/>
     </w:rPr>
@@ -739,7 +739,7 @@
       <w:jc w:val="center"/>
     </w:pPr>
     <w:rPr>
-      <w:rFonts w:eastAsiaTheme="majorEastAsia" w:cstheme="majorBidi" w:ascii="Times New Roman" w:hAnsi="Times New Roman" w:cs="Times New Roman" w:eastAsia="Times New Roman"/>
+      <w:rFonts w:ascii="Times New Roman" w:hAnsi="Times New Roman" w:cs="Times New Roman" w:eastAsia="Times New Roman"/>
       <w:sz w:val="24"/>
       <w:szCs w:val="24"/>
     </w:rPr>
@@ -1115,7 +1115,7 @@
     <w:name w:val="Verbatim Char"/>
     <w:basedOn w:val="BodyTextChar"/>
     <w:rPr>
-      <w:rFonts w:ascii="Consolas" w:hAnsi="Consolas"/>
+      <w:rFonts w:ascii="Courier New" w:hAnsi="Courier New"/>
       <w:sz w:val="22"/>
     </w:rPr>
   </w:style>
@@ -1201,7 +1201,7 @@
     </a:clrScheme>
     <a:fontScheme name="Office">
       <a:majorFont>
-        <a:latin typeface="Aptos Display" panose="02110004020202020204"/>
+        <a:latin typeface="Times New Roman" panose="02110004020202020204"/>
         <a:ea typeface=""/>
         <a:cs typeface=""/>
         <a:font script="Jpan" typeface="游ゴシック Light"/>
@@ -1253,7 +1253,7 @@
         <a:font script="Tfng" typeface="Ebrima"/>
       </a:majorFont>
       <a:minorFont>
-        <a:latin typeface="Aptos" panose="02110004020202020204"/>
+        <a:latin typeface="Times New Roman" panose="02110004020202020204"/>
         <a:ea typeface=""/>
         <a:cs typeface=""/>
         <a:font script="Jpan" typeface="游明朝"/>

</xml_diff>

<commit_message>
Add page-number running header to Word reference doc (standard manuscript format)
Pandoc's reference doc ships an empty header, so Word exports had no page
numbers — a real omission for submission format. Wire a full header part
chain into the reference doc (header XML with a right-aligned PAGE field,
content-type override, relationship, and sectPr headerReference); pandoc
carries all of it through to output. PAGE field uses the complete
begin/instrText/separate/cached/end form so it renders in Word and Pages.
Verified: header part + rId resolve in converted output, fonts still clean.

Co-Authored-By: Claude Opus 4.8 <noreply@anthropic.com>
</commit_message>
<xml_diff>
--- a/src/assets/pandoc/reference-manuscript.docx
+++ b/src/assets/pandoc/reference-manuscript.docx
@@ -314,6 +314,7 @@
       </w:r>
     </w:p>
     <w:sectPr>
+      <w:headerReference w:type="default" r:id="rId777"/>
       <w:footnotePr>
         <w:numRestart w:val="eachSect"/>
       </w:footnotePr>
@@ -367,6 +368,61 @@
     </w:p>
   </w:footnote>
 </w:footnotes>
+</file>
+
+<file path=word/header-rt.xml><?xml version="1.0" encoding="utf-8"?>
+<w:hdr xmlns:w="http://schemas.openxmlformats.org/wordprocessingml/2006/main" xmlns:r="http://schemas.openxmlformats.org/officeDocument/2006/relationships">
+  <w:p>
+    <w:pPr>
+      <w:jc w:val="right"/>
+      <w:rPr>
+        <w:rFonts w:ascii="Times New Roman" w:hAnsi="Times New Roman" w:cs="Times New Roman"/>
+        <w:sz w:val="24"/>
+        <w:szCs w:val="24"/>
+      </w:rPr>
+    </w:pPr>
+    <w:r>
+      <w:rPr>
+        <w:rFonts w:ascii="Times New Roman" w:hAnsi="Times New Roman" w:cs="Times New Roman"/>
+        <w:sz w:val="24"/>
+        <w:szCs w:val="24"/>
+      </w:rPr>
+      <w:fldChar w:fldCharType="begin"/>
+    </w:r>
+    <w:r>
+      <w:rPr>
+        <w:rFonts w:ascii="Times New Roman" w:hAnsi="Times New Roman" w:cs="Times New Roman"/>
+        <w:sz w:val="24"/>
+        <w:szCs w:val="24"/>
+      </w:rPr>
+      <w:instrText xml:space="preserve"> PAGE </w:instrText>
+    </w:r>
+    <w:r>
+      <w:rPr>
+        <w:rFonts w:ascii="Times New Roman" w:hAnsi="Times New Roman" w:cs="Times New Roman"/>
+        <w:sz w:val="24"/>
+        <w:szCs w:val="24"/>
+      </w:rPr>
+      <w:fldChar w:fldCharType="separate"/>
+    </w:r>
+    <w:r>
+      <w:rPr>
+        <w:rFonts w:ascii="Times New Roman" w:hAnsi="Times New Roman" w:cs="Times New Roman"/>
+        <w:sz w:val="24"/>
+        <w:szCs w:val="24"/>
+      </w:rPr>
+      <w:t>1</w:t>
+    </w:r>
+    <w:r>
+      <w:rPr>
+        <w:rFonts w:ascii="Times New Roman" w:hAnsi="Times New Roman" w:cs="Times New Roman"/>
+        <w:sz w:val="24"/>
+        <w:szCs w:val="24"/>
+      </w:rPr>
+      <w:fldChar w:fldCharType="end"/>
+    </w:r>
+  </w:p>
+</w:hdr>
 </file>
 
 <file path=word/numbering.xml><?xml version="1.0" encoding="utf-8"?>

</xml_diff>